<commit_message>
Update Acknowledgement: new text, inline bold names, typo fix
</commit_message>
<xml_diff>
--- a/Acknowledgement.docx
+++ b/Acknowledgement.docx
@@ -4,13 +4,12 @@
   <w:body>
     <w:p>
       <w:pPr>
-        <w:spacing w:before="0" w:after="240"/>
         <w:jc w:val="center"/>
         <w:spacing w:line="360" w:lineRule="auto"/>
       </w:pPr>
       <w:r>
         <w:rPr>
-          <w:rFonts w:ascii="Times New Roman" w:hAnsi="Times New Roman"/>
+          <w:rFonts w:ascii="Times New Roman" w:hAnsi="Times New Roman" w:cs="Times New Roman"/>
           <w:b/>
           <w:sz w:val="28"/>
         </w:rPr>
@@ -19,13 +18,13 @@
     </w:p>
     <w:p>
       <w:pPr>
-        <w:spacing w:before="0" w:after="240"/>
         <w:jc w:val="both"/>
         <w:spacing w:line="360" w:lineRule="auto"/>
       </w:pPr>
       <w:r>
         <w:rPr>
-          <w:rFonts w:ascii="Times New Roman" w:hAnsi="Times New Roman"/>
+          <w:rFonts w:ascii="Times New Roman" w:hAnsi="Times New Roman" w:cs="Times New Roman"/>
+          <w:b/>
           <w:sz w:val="24"/>
         </w:rPr>
         <w:t>In the name of Allah, the Most Gracious, the Most Merciful.</w:t>
@@ -33,100 +32,212 @@
     </w:p>
     <w:p>
       <w:pPr>
-        <w:spacing w:before="0" w:after="240"/>
         <w:jc w:val="both"/>
         <w:spacing w:line="360" w:lineRule="auto"/>
       </w:pPr>
       <w:r>
         <w:rPr>
-          <w:rFonts w:ascii="Times New Roman" w:hAnsi="Times New Roman"/>
+          <w:rFonts w:ascii="Times New Roman" w:hAnsi="Times New Roman" w:cs="Times New Roman"/>
+          <w:b w:val="0"/>
           <w:sz w:val="24"/>
         </w:rPr>
-        <w:t>First and foremost, the author expresses profound gratitude to Allah (SWT) for His infinite mercy, guidance, blessings, and strength throughout this academic journey. By His grace, the author was granted the perseverance, knowledge, and opportunities necessary to successfully complete this project.</w:t>
+        <w:t xml:space="preserve">First and foremost, the author expresses sincere gratitude to </w:t>
+      </w:r>
+      <w:r>
+        <w:rPr>
+          <w:rFonts w:ascii="Times New Roman" w:hAnsi="Times New Roman" w:cs="Times New Roman"/>
+          <w:b/>
+          <w:sz w:val="24"/>
+        </w:rPr>
+        <w:t>Allah (SWT)</w:t>
+      </w:r>
+      <w:r>
+        <w:rPr>
+          <w:rFonts w:ascii="Times New Roman" w:hAnsi="Times New Roman" w:cs="Times New Roman"/>
+          <w:b w:val="0"/>
+          <w:sz w:val="24"/>
+        </w:rPr>
+        <w:t xml:space="preserve"> for His infinite mercy, countless blessings, guidance, and strength throughout this academic journey. By His grace, the author was able to overcome challenges and successfully complete this project.</w:t>
       </w:r>
     </w:p>
     <w:p>
       <w:pPr>
-        <w:spacing w:before="0" w:after="240"/>
         <w:jc w:val="both"/>
         <w:spacing w:line="360" w:lineRule="auto"/>
       </w:pPr>
       <w:r>
         <w:rPr>
-          <w:rFonts w:ascii="Times New Roman" w:hAnsi="Times New Roman"/>
+          <w:rFonts w:ascii="Times New Roman" w:hAnsi="Times New Roman" w:cs="Times New Roman"/>
+          <w:b w:val="0"/>
           <w:sz w:val="24"/>
         </w:rPr>
-        <w:t>The author extends heartfelt appreciation to Mr. Rashid Akber and Mrs. Kaniz Sakeena Rashid for their unwavering love, endless sacrifices, constant encouragement, prayers, and unconditional support. Their guidance, patience, and steadfast belief have been the foundation of the author's personal and academic growth and a continuous source of motivation throughout this endeavor.</w:t>
+        <w:t xml:space="preserve">The author extends heartfelt appreciation to </w:t>
+      </w:r>
+      <w:r>
+        <w:rPr>
+          <w:rFonts w:ascii="Times New Roman" w:hAnsi="Times New Roman" w:cs="Times New Roman"/>
+          <w:b/>
+          <w:sz w:val="24"/>
+        </w:rPr>
+        <w:t>Mr. Rashid Akber</w:t>
+      </w:r>
+      <w:r>
+        <w:rPr>
+          <w:rFonts w:ascii="Times New Roman" w:hAnsi="Times New Roman" w:cs="Times New Roman"/>
+          <w:b w:val="0"/>
+          <w:sz w:val="24"/>
+        </w:rPr>
+        <w:t xml:space="preserve"> and </w:t>
+      </w:r>
+      <w:r>
+        <w:rPr>
+          <w:rFonts w:ascii="Times New Roman" w:hAnsi="Times New Roman" w:cs="Times New Roman"/>
+          <w:b/>
+          <w:sz w:val="24"/>
+        </w:rPr>
+        <w:t>Mrs. Kaniz Sakeena Rashid</w:t>
+      </w:r>
+      <w:r>
+        <w:rPr>
+          <w:rFonts w:ascii="Times New Roman" w:hAnsi="Times New Roman" w:cs="Times New Roman"/>
+          <w:b w:val="0"/>
+          <w:sz w:val="24"/>
+        </w:rPr>
+        <w:t xml:space="preserve"> for their unwavering love, sacrifices, prayers, encouragement, and constant support. Their guidance, patience, and belief have been a source of inspiration and strength throughout the completion of this work.</w:t>
       </w:r>
     </w:p>
     <w:p>
       <w:pPr>
-        <w:spacing w:before="0" w:after="240"/>
         <w:jc w:val="both"/>
         <w:spacing w:line="360" w:lineRule="auto"/>
       </w:pPr>
       <w:r>
         <w:rPr>
-          <w:rFonts w:ascii="Times New Roman" w:hAnsi="Times New Roman"/>
+          <w:rFonts w:ascii="Times New Roman" w:hAnsi="Times New Roman" w:cs="Times New Roman"/>
+          <w:b w:val="0"/>
           <w:sz w:val="24"/>
         </w:rPr>
-        <w:t>Special gratitude is extended to Ms. Rida Fatima for her immense patience, understanding, encouragement, and unwavering moral support. Her constant reassurance, kindness, and belief in the author provided strength and motivation during challenging phases of this project.</w:t>
+        <w:t xml:space="preserve">Special thanks are extended to </w:t>
+      </w:r>
+      <w:r>
+        <w:rPr>
+          <w:rFonts w:ascii="Times New Roman" w:hAnsi="Times New Roman" w:cs="Times New Roman"/>
+          <w:b/>
+          <w:sz w:val="24"/>
+        </w:rPr>
+        <w:t>Ms. Rida Fatima</w:t>
+      </w:r>
+      <w:r>
+        <w:rPr>
+          <w:rFonts w:ascii="Times New Roman" w:hAnsi="Times New Roman" w:cs="Times New Roman"/>
+          <w:b w:val="0"/>
+          <w:sz w:val="24"/>
+        </w:rPr>
+        <w:t xml:space="preserve"> for her patience, understanding, unwavering moral support, and encouragement. Her positive influence and constant motivation were invaluable during the course of this project.</w:t>
       </w:r>
     </w:p>
     <w:p>
       <w:pPr>
-        <w:spacing w:before="0" w:after="240"/>
         <w:jc w:val="both"/>
         <w:spacing w:line="360" w:lineRule="auto"/>
       </w:pPr>
       <w:r>
         <w:rPr>
-          <w:rFonts w:ascii="Times New Roman" w:hAnsi="Times New Roman"/>
+          <w:rFonts w:ascii="Times New Roman" w:hAnsi="Times New Roman" w:cs="Times New Roman"/>
+          <w:b w:val="0"/>
           <w:sz w:val="24"/>
         </w:rPr>
-        <w:t>The author is deeply indebted to Prof. Mohammad Muzammil for his invaluable guidance, insightful suggestions, constructive feedback, and continuous encouragement throughout the course of this work. His mentorship, expertise, and academic support were instrumental in shaping the direction and successful completion of this project.</w:t>
+        <w:t xml:space="preserve">The author is deeply grateful to </w:t>
+      </w:r>
+      <w:r>
+        <w:rPr>
+          <w:rFonts w:ascii="Times New Roman" w:hAnsi="Times New Roman" w:cs="Times New Roman"/>
+          <w:b/>
+          <w:sz w:val="24"/>
+        </w:rPr>
+        <w:t>Prof. Mohammad Muzammil</w:t>
+      </w:r>
+      <w:r>
+        <w:rPr>
+          <w:rFonts w:ascii="Times New Roman" w:hAnsi="Times New Roman" w:cs="Times New Roman"/>
+          <w:b w:val="0"/>
+          <w:sz w:val="24"/>
+        </w:rPr>
+        <w:t xml:space="preserve"> for his invaluable guidance, insightful suggestions, constructive feedback, and continuous encouragement. His mentorship and expertise played a crucial role in shaping and successfully completing this project.</w:t>
       </w:r>
     </w:p>
     <w:p>
       <w:pPr>
-        <w:spacing w:before="0" w:after="240"/>
         <w:jc w:val="both"/>
         <w:spacing w:line="360" w:lineRule="auto"/>
       </w:pPr>
       <w:r>
         <w:rPr>
-          <w:rFonts w:ascii="Times New Roman" w:hAnsi="Times New Roman"/>
+          <w:rFonts w:ascii="Times New Roman" w:hAnsi="Times New Roman" w:cs="Times New Roman"/>
+          <w:b w:val="0"/>
           <w:sz w:val="24"/>
         </w:rPr>
-        <w:t>Sincere appreciation is also extended to Mr. Sheikh Noorul, project partner, for his dedication, cooperation, and collaborative efforts throughout the development of this project. His teamwork, valuable contributions, and willingness to overcome challenges together greatly facilitated the achievement of the project objectives.</w:t>
+        <w:t xml:space="preserve">Sincere appreciation is also extended to </w:t>
+      </w:r>
+      <w:r>
+        <w:rPr>
+          <w:rFonts w:ascii="Times New Roman" w:hAnsi="Times New Roman" w:cs="Times New Roman"/>
+          <w:b/>
+          <w:sz w:val="24"/>
+        </w:rPr>
+        <w:t>Mr. Sheikh Noorul</w:t>
+      </w:r>
+      <w:r>
+        <w:rPr>
+          <w:rFonts w:ascii="Times New Roman" w:hAnsi="Times New Roman" w:cs="Times New Roman"/>
+          <w:b w:val="0"/>
+          <w:sz w:val="24"/>
+        </w:rPr>
+        <w:t>, project partner, for his cooperation, dedication, and collaborative efforts throughout the development of this project. His support, teamwork, and valuable contributions greatly facilitated the successful accomplishment of the project objectives.</w:t>
       </w:r>
     </w:p>
     <w:p>
       <w:pPr>
-        <w:spacing w:before="0" w:after="240"/>
         <w:jc w:val="both"/>
         <w:spacing w:line="360" w:lineRule="auto"/>
       </w:pPr>
       <w:r>
         <w:rPr>
-          <w:rFonts w:ascii="Times New Roman" w:hAnsi="Times New Roman"/>
+          <w:rFonts w:ascii="Times New Roman" w:hAnsi="Times New Roman" w:cs="Times New Roman"/>
+          <w:b w:val="0"/>
           <w:sz w:val="24"/>
         </w:rPr>
-        <w:t>The author would also like to express sincere gratitude to all faculty members of the Department of Mechanical Engineering for their guidance, encouragement, and support throughout the academic program. Their knowledge and assistance have contributed significantly to the author's learning and development.</w:t>
+        <w:t xml:space="preserve">The author would also like to thank all </w:t>
+      </w:r>
+      <w:r>
+        <w:rPr>
+          <w:rFonts w:ascii="Times New Roman" w:hAnsi="Times New Roman" w:cs="Times New Roman"/>
+          <w:b/>
+          <w:sz w:val="24"/>
+        </w:rPr>
+        <w:t>faculty members of the Department of Mechanical Engineering</w:t>
+      </w:r>
+      <w:r>
+        <w:rPr>
+          <w:rFonts w:ascii="Times New Roman" w:hAnsi="Times New Roman" w:cs="Times New Roman"/>
+          <w:b w:val="0"/>
+          <w:sz w:val="24"/>
+        </w:rPr>
+        <w:t xml:space="preserve"> for their guidance, encouragement, and support throughout this academic endeavor.</w:t>
       </w:r>
     </w:p>
     <w:p>
       <w:pPr>
-        <w:spacing w:before="0" w:after="240"/>
         <w:jc w:val="both"/>
         <w:spacing w:line="360" w:lineRule="auto"/>
       </w:pPr>
       <w:r>
         <w:rPr>
-          <w:rFonts w:ascii="Times New Roman" w:hAnsi="Times New Roman"/>
+          <w:rFonts w:ascii="Times New Roman" w:hAnsi="Times New Roman" w:cs="Times New Roman"/>
+          <w:b w:val="0"/>
           <w:sz w:val="24"/>
         </w:rPr>
-        <w:t>Finally, heartfelt thanks are extended to family members, friends, and well-wishers whose encouragement, understanding, prayers, and support provided constant motivation and inspiration throughout this journey. Their confidence and goodwill contributed greatly to the successful completion of this work.</w:t>
+        <w:t>Finally, heartfelt thanks are extended to family members, friends, and well-wishers for their encouragement, understanding, and support, which provided constant motivation throughout this journey.</w:t>
       </w:r>
     </w:p>
     <w:sectPr>

</xml_diff>